<commit_message>
gán Logic Lần 1 cho chọn ghế
</commit_message>
<xml_diff>
--- a/Note_Mobile.docx
+++ b/Note_Mobile.docx
@@ -114,6 +114,13 @@
           <w:lang w:val="en-US"/>
         </w:rPr>
       </w:pPr>
+      <w:r>
+        <w:rPr>
+          <w:rFonts w:hint="default"/>
+          <w:lang w:val="en-US"/>
+        </w:rPr>
+        <w:t xml:space="preserve">Tạo các fragment tương ứng cho màn hình ĐẶT GHẾ </w:t>
+      </w:r>
       <w:bookmarkStart w:id="0" w:name="_GoBack"/>
       <w:bookmarkEnd w:id="0"/>
     </w:p>

</xml_diff>